<commit_message>
(feat): added final test results
</commit_message>
<xml_diff>
--- a/dq_checks/1_Test_Strategy.docx
+++ b/dq_checks/1_Test_Strategy.docx
@@ -226,6 +226,18 @@
         </w:rPr>
       </w:pPr>
     </w:p>
+    <w:p>
+      <w:pPr>
+        <w:widowControl/>
+        <w:spacing w:line="240" w:lineRule="auto"/>
+        <w:rPr>
+          <w:rFonts w:ascii="Arial Black" w:eastAsia="Trebuchet MS" w:hAnsi="Arial Black"/>
+          <w:caps/>
+          <w:color w:val="464547"/>
+          <w:sz w:val="28"/>
+        </w:rPr>
+      </w:pPr>
+    </w:p>
     <w:sdt>
       <w:sdtPr>
         <w:rPr>
@@ -6456,6 +6468,8 @@
                 <w:rFonts w:eastAsia="Trebuchet MS"/>
               </w:rPr>
             </w:pPr>
+            <w:proofErr w:type="spellStart"/>
+            <w:proofErr w:type="gramStart"/>
             <w:r>
               <w:rPr>
                 <w:rFonts w:eastAsia="Trebuchet MS"/>
@@ -6482,27 +6496,55 @@
                 <w:i/>
                 <w:iCs/>
               </w:rPr>
-              <w:t>sales, sa</w:t>
-            </w:r>
-            <w:r>
-              <w:rPr>
-                <w:rFonts w:eastAsia="Trebuchet MS"/>
-              </w:rPr>
-              <w:t>ecom.src</w:t>
-            </w:r>
+              <w:t>sales</w:t>
+            </w:r>
+            <w:proofErr w:type="spellEnd"/>
+            <w:proofErr w:type="gramEnd"/>
             <w:r>
               <w:rPr>
                 <w:rFonts w:eastAsia="Trebuchet MS"/>
                 <w:i/>
                 <w:iCs/>
               </w:rPr>
+              <w:t xml:space="preserve">, </w:t>
+            </w:r>
+            <w:proofErr w:type="spellStart"/>
+            <w:proofErr w:type="gramStart"/>
+            <w:r>
+              <w:rPr>
+                <w:rFonts w:eastAsia="Trebuchet MS"/>
+                <w:i/>
+                <w:iCs/>
+              </w:rPr>
+              <w:t>sa</w:t>
+            </w:r>
+            <w:r>
+              <w:rPr>
+                <w:rFonts w:eastAsia="Trebuchet MS"/>
+              </w:rPr>
+              <w:t>ecom.src</w:t>
+            </w:r>
+            <w:r>
+              <w:rPr>
+                <w:rFonts w:eastAsia="Trebuchet MS"/>
+                <w:i/>
+                <w:iCs/>
+              </w:rPr>
               <w:t>ecom</w:t>
             </w:r>
             <w:r>
               <w:rPr>
                 <w:rFonts w:eastAsia="Trebuchet MS"/>
               </w:rPr>
-              <w:t>sales - extraction, type casting, deduplication, sensitive data exclusion</w:t>
+              <w:t>sales</w:t>
+            </w:r>
+            <w:proofErr w:type="spellEnd"/>
+            <w:proofErr w:type="gramEnd"/>
+            <w:r>
+              <w:rPr>
+                <w:rFonts w:eastAsia="Trebuchet MS"/>
+              </w:rPr>
+              <w:t xml:space="preserve"> - extraction, type casting, deduplication, sensitive data exclusion</w:t>
             </w:r>
           </w:p>
         </w:tc>
@@ -6703,7 +6745,21 @@
               <w:rPr>
                 <w:rFonts w:eastAsia="Trebuchet MS"/>
               </w:rPr>
-              <w:t>Report structure, visuals, KPIs, filters, drill-downs, navigation, formatting, and non-functional behavior once the report is developed</w:t>
+              <w:t xml:space="preserve">Report structure, visuals, KPIs, filters, </w:t>
+            </w:r>
+            <w:proofErr w:type="gramStart"/>
+            <w:r>
+              <w:rPr>
+                <w:rFonts w:eastAsia="Trebuchet MS"/>
+              </w:rPr>
+              <w:t>drill-downs</w:t>
+            </w:r>
+            <w:proofErr w:type="gramEnd"/>
+            <w:r>
+              <w:rPr>
+                <w:rFonts w:eastAsia="Trebuchet MS"/>
+              </w:rPr>
+              <w:t>, navigation, formatting, and non-functional behavior once the report is developed</w:t>
             </w:r>
           </w:p>
         </w:tc>
@@ -7137,7 +7193,21 @@
         <w:rPr>
           <w:rFonts w:eastAsia="Trebuchet MS"/>
         </w:rPr>
-        <w:t>No untested transformation logic is delivered as part of a build.</w:t>
+        <w:t xml:space="preserve">No untested transformation logic is delivered as part of a </w:t>
+      </w:r>
+      <w:proofErr w:type="gramStart"/>
+      <w:r>
+        <w:rPr>
+          <w:rFonts w:eastAsia="Trebuchet MS"/>
+        </w:rPr>
+        <w:t>build</w:t>
+      </w:r>
+      <w:proofErr w:type="gramEnd"/>
+      <w:r>
+        <w:rPr>
+          <w:rFonts w:eastAsia="Trebuchet MS"/>
+        </w:rPr>
+        <w:t>.</w:t>
       </w:r>
     </w:p>
     <w:p>
@@ -7362,7 +7432,35 @@
               <w:rPr>
                 <w:rFonts w:eastAsia="Trebuchet MS"/>
               </w:rPr>
-              <w:t>Individual ETL job / procedure (e.g., a single prc_load_ce_* or prc_load_dim_* procedure) verified in isolation against its own input and expected output</w:t>
+              <w:t>Individual ETL job / procedure (e.g., a single </w:t>
+            </w:r>
+            <w:proofErr w:type="spellStart"/>
+            <w:r>
+              <w:rPr>
+                <w:rFonts w:eastAsia="Trebuchet MS"/>
+              </w:rPr>
+              <w:t>prc_load_ce</w:t>
+            </w:r>
+            <w:proofErr w:type="spellEnd"/>
+            <w:r>
+              <w:rPr>
+                <w:rFonts w:eastAsia="Trebuchet MS"/>
+              </w:rPr>
+              <w:t>_* or </w:t>
+            </w:r>
+            <w:proofErr w:type="spellStart"/>
+            <w:r>
+              <w:rPr>
+                <w:rFonts w:eastAsia="Trebuchet MS"/>
+              </w:rPr>
+              <w:t>prc_load_dim</w:t>
+            </w:r>
+            <w:proofErr w:type="spellEnd"/>
+            <w:r>
+              <w:rPr>
+                <w:rFonts w:eastAsia="Trebuchet MS"/>
+              </w:rPr>
+              <w:t>_* procedure) verified in isolation against its own input and expected output</w:t>
             </w:r>
           </w:p>
         </w:tc>
@@ -7946,7 +8044,21 @@
               <w:rPr>
                 <w:rFonts w:eastAsia="Trebuchet MS"/>
               </w:rPr>
-              <w:t>Confirm the build is stable enough for deeper testing: ETL completed without error, expected tables are populated, the .pbix file opens, and all report pages load</w:t>
+              <w:t>Confirm the build is stable enough for deeper testing: ETL completed without error, expected tables are populated, the .</w:t>
+            </w:r>
+            <w:proofErr w:type="spellStart"/>
+            <w:r>
+              <w:rPr>
+                <w:rFonts w:eastAsia="Trebuchet MS"/>
+              </w:rPr>
+              <w:t>pbix</w:t>
+            </w:r>
+            <w:proofErr w:type="spellEnd"/>
+            <w:r>
+              <w:rPr>
+                <w:rFonts w:eastAsia="Trebuchet MS"/>
+              </w:rPr>
+              <w:t xml:space="preserve"> file opens, and all report pages load</w:t>
             </w:r>
           </w:p>
         </w:tc>
@@ -8666,7 +8778,21 @@
               <w:rPr>
                 <w:rFonts w:eastAsia="Trebuchet MS"/>
               </w:rPr>
-              <w:t>Previously verified functionality remains correct after a code, schema, or data change</w:t>
+              <w:t xml:space="preserve">Previously verified functionality </w:t>
+            </w:r>
+            <w:proofErr w:type="gramStart"/>
+            <w:r>
+              <w:rPr>
+                <w:rFonts w:eastAsia="Trebuchet MS"/>
+              </w:rPr>
+              <w:t>remains</w:t>
+            </w:r>
+            <w:proofErr w:type="gramEnd"/>
+            <w:r>
+              <w:rPr>
+                <w:rFonts w:eastAsia="Trebuchet MS"/>
+              </w:rPr>
+              <w:t xml:space="preserve"> correct after a code, schema, or data change</w:t>
             </w:r>
           </w:p>
         </w:tc>
@@ -8975,7 +9101,21 @@
               <w:rPr>
                 <w:rFonts w:eastAsia="Trebuchet MS"/>
               </w:rPr>
-              <w:t>Correctness of visuals, KPIs, filters, drill-downs, navigation, and layout against the report requirements</w:t>
+              <w:t xml:space="preserve">Correctness of visuals, KPIs, filters, </w:t>
+            </w:r>
+            <w:proofErr w:type="gramStart"/>
+            <w:r>
+              <w:rPr>
+                <w:rFonts w:eastAsia="Trebuchet MS"/>
+              </w:rPr>
+              <w:t>drill-downs</w:t>
+            </w:r>
+            <w:proofErr w:type="gramEnd"/>
+            <w:r>
+              <w:rPr>
+                <w:rFonts w:eastAsia="Trebuchet MS"/>
+              </w:rPr>
+              <w:t>, navigation, and layout against the report requirements</w:t>
             </w:r>
           </w:p>
         </w:tc>
@@ -9162,7 +9302,21 @@
           <w:rFonts w:eastAsia="Trebuchet MS"/>
         </w:rPr>
         <w:lastRenderedPageBreak/>
-        <w:t>Ad hoc / exploratory testing of attribute and measure combinations that are impractical to fully automate.</w:t>
+        <w:t xml:space="preserve">Ad hoc / </w:t>
+      </w:r>
+      <w:proofErr w:type="gramStart"/>
+      <w:r>
+        <w:rPr>
+          <w:rFonts w:eastAsia="Trebuchet MS"/>
+        </w:rPr>
+        <w:t>exploratory</w:t>
+      </w:r>
+      <w:proofErr w:type="gramEnd"/>
+      <w:r>
+        <w:rPr>
+          <w:rFonts w:eastAsia="Trebuchet MS"/>
+        </w:rPr>
+        <w:t xml:space="preserve"> testing of attribute and measure combinations that are impractical to fully automate.</w:t>
       </w:r>
     </w:p>
     <w:p>
@@ -9260,11 +9414,19 @@
           <w:rFonts w:eastAsia="Trebuchet MS"/>
         </w:rPr>
       </w:pPr>
+      <w:proofErr w:type="spellStart"/>
       <w:r>
         <w:rPr>
           <w:rFonts w:eastAsia="Trebuchet MS"/>
         </w:rPr>
-        <w:t>Restartability checks (re-running load procedures on unchanged data produces no additional inserts or updates).</w:t>
+        <w:t>Restartability</w:t>
+      </w:r>
+      <w:proofErr w:type="spellEnd"/>
+      <w:r>
+        <w:rPr>
+          <w:rFonts w:eastAsia="Trebuchet MS"/>
+        </w:rPr>
+        <w:t xml:space="preserve"> checks (re-running load procedures on unchanged data produces no additional inserts or updates).</w:t>
       </w:r>
     </w:p>
     <w:p>
@@ -9282,7 +9444,49 @@
         <w:rPr>
           <w:rFonts w:eastAsia="Trebuchet MS"/>
         </w:rPr>
-        <w:t>Optionally, a Python-based framework (for example pytest with SQLAlchemy) or a dedicated data-quality framework (for example Great Expectations or dbt tests) for repeatable, scheduled data quality checks.</w:t>
+        <w:t xml:space="preserve">Optionally, a Python-based framework (for example </w:t>
+      </w:r>
+      <w:proofErr w:type="spellStart"/>
+      <w:r>
+        <w:rPr>
+          <w:rFonts w:eastAsia="Trebuchet MS"/>
+        </w:rPr>
+        <w:t>pytest</w:t>
+      </w:r>
+      <w:proofErr w:type="spellEnd"/>
+      <w:r>
+        <w:rPr>
+          <w:rFonts w:eastAsia="Trebuchet MS"/>
+        </w:rPr>
+        <w:t xml:space="preserve"> with </w:t>
+      </w:r>
+      <w:proofErr w:type="spellStart"/>
+      <w:r>
+        <w:rPr>
+          <w:rFonts w:eastAsia="Trebuchet MS"/>
+        </w:rPr>
+        <w:t>SQLAlchemy</w:t>
+      </w:r>
+      <w:proofErr w:type="spellEnd"/>
+      <w:r>
+        <w:rPr>
+          <w:rFonts w:eastAsia="Trebuchet MS"/>
+        </w:rPr>
+        <w:t xml:space="preserve">) or a dedicated data-quality framework (for example Great Expectations or </w:t>
+      </w:r>
+      <w:proofErr w:type="spellStart"/>
+      <w:r>
+        <w:rPr>
+          <w:rFonts w:eastAsia="Trebuchet MS"/>
+        </w:rPr>
+        <w:t>dbt</w:t>
+      </w:r>
+      <w:proofErr w:type="spellEnd"/>
+      <w:r>
+        <w:rPr>
+          <w:rFonts w:eastAsia="Trebuchet MS"/>
+        </w:rPr>
+        <w:t xml:space="preserve"> tests) for repeatable, scheduled data quality checks.</w:t>
       </w:r>
     </w:p>
     <w:p>
@@ -9573,14 +9777,36 @@
         <w:rPr>
           <w:rFonts w:ascii="Trebuchet MS" w:eastAsia="Trebuchet MS" w:hAnsi="Trebuchet MS" w:cs="Arial"/>
         </w:rPr>
-        <w:t xml:space="preserve">Whether Row-Level Security is required for this solution remains unconfirmed at the time of this update. No dedicated security-specific test results were logged in this test cycle; sensitive-column exclusion is inferred indirectly from the 100% Critical Path pass rate (Section 19), but no explicit </w:t>
+        <w:t xml:space="preserve">Row-Level Security is confirmed not applicable to this solution's current scope — no RLS infrastructure exists at the database or reporting layer, consistent with the explicit out-of-scope acknowledgment in this cycle's gap analysis. Sensitive column exclusion is confirmed via direct query: all previously </w:t>
       </w:r>
       <w:r>
         <w:rPr>
           <w:rFonts w:ascii="Trebuchet MS" w:eastAsia="Trebuchet MS" w:hAnsi="Trebuchet MS" w:cs="Arial"/>
         </w:rPr>
         <w:lastRenderedPageBreak/>
-        <w:t>security test evidence (e.g., a distinct "Security" test category or dimension) was found among the executed test results.</w:t>
+        <w:t xml:space="preserve">identified sensitive columns (SSN, credit card, CVV, IBAN, bank number) remain absent from BL_3NF, BL_DM, and the report across both source systems, with 0 exceptions found. Power BI report-level security behavior (e.g., no sensitive field exposed in visuals, tooltips, or exports) was verified manually during this cycle and passed; results are not present in the automated test log because this verification was performed by hand, not via an automated SQL/DAX </w:t>
+      </w:r>
+      <w:proofErr w:type="spellStart"/>
+      <w:proofErr w:type="gramStart"/>
+      <w:r>
+        <w:rPr>
+          <w:rFonts w:ascii="Trebuchet MS" w:eastAsia="Trebuchet MS" w:hAnsi="Trebuchet MS" w:cs="Arial"/>
+        </w:rPr>
+        <w:t>check.</w:t>
+      </w:r>
+      <w:r>
+        <w:rPr>
+          <w:rFonts w:ascii="Trebuchet MS" w:eastAsia="Trebuchet MS" w:hAnsi="Trebuchet MS" w:cs="Arial"/>
+        </w:rPr>
+        <w:t>security</w:t>
+      </w:r>
+      <w:proofErr w:type="spellEnd"/>
+      <w:proofErr w:type="gramEnd"/>
+      <w:r>
+        <w:rPr>
+          <w:rFonts w:ascii="Trebuchet MS" w:eastAsia="Trebuchet MS" w:hAnsi="Trebuchet MS" w:cs="Arial"/>
+        </w:rPr>
+        <w:t xml:space="preserve"> test evidence (e.g., a distinct "Security" test category or dimension) was found among the executed test results.</w:t>
       </w:r>
     </w:p>
     <w:p>
@@ -9618,7 +9844,21 @@
         <w:rPr>
           <w:rFonts w:eastAsia="Trebuchet MS"/>
         </w:rPr>
-        <w:t xml:space="preserve"> Verify that ETL loads, queries, and report operations complete within an acceptable time frame for the data volumes used in this project.</w:t>
+        <w:t xml:space="preserve"> Verify that ETL loads, queries, and report operations </w:t>
+      </w:r>
+      <w:proofErr w:type="gramStart"/>
+      <w:r>
+        <w:rPr>
+          <w:rFonts w:eastAsia="Trebuchet MS"/>
+        </w:rPr>
+        <w:t>complete</w:t>
+      </w:r>
+      <w:proofErr w:type="gramEnd"/>
+      <w:r>
+        <w:rPr>
+          <w:rFonts w:eastAsia="Trebuchet MS"/>
+        </w:rPr>
+        <w:t xml:space="preserve"> within an acceptable time frame for the data volumes used in this project.</w:t>
       </w:r>
     </w:p>
     <w:p>
@@ -9674,7 +9914,21 @@
         <w:rPr>
           <w:rFonts w:eastAsia="Trebuchet MS"/>
         </w:rPr>
-        <w:t>Measure end-to-end duration of each ETL script (SA, BL_3NF, BL_DM) using the sample data sets and record a baseline.</w:t>
+        <w:t xml:space="preserve">Measure end-to-end duration of each ETL script (SA, BL_3NF, BL_DM) using the sample data sets and </w:t>
+      </w:r>
+      <w:proofErr w:type="gramStart"/>
+      <w:r>
+        <w:rPr>
+          <w:rFonts w:eastAsia="Trebuchet MS"/>
+        </w:rPr>
+        <w:t>record</w:t>
+      </w:r>
+      <w:proofErr w:type="gramEnd"/>
+      <w:r>
+        <w:rPr>
+          <w:rFonts w:eastAsia="Trebuchet MS"/>
+        </w:rPr>
+        <w:t xml:space="preserve"> a baseline.</w:t>
       </w:r>
     </w:p>
     <w:p>
@@ -9830,7 +10084,7 @@
         <w:rPr>
           <w:rFonts w:eastAsia="Trebuchet MS"/>
         </w:rPr>
-        <w:t>No performance or timing measurements (ETL load duration, report refresh time, visual render time) were captured during this test cycle. No formal performance thresholds have been defined for this internship project. This remains an open item - a baseline measurement should be established in a subsequent test cycle before performance can be assessed against any criterion.</w:t>
+        <w:t>Power BI report performance (report open time, refresh time, and visual render time via Performance Analyzer) was verified manually during this test cycle and passed — no visual or refresh operation was flagged as slow or unresponsive. These results are not present in the automated test log, as this verification was performed manually rather than through a scripted timing check. ETL load duration (SA, BL_3NF, BL_DM script execution time) remains unmeasured in this cycle; no formal SLA has been defined for database-layer performance. This remains an open item for a future test cycle if ETL timing baselines are required.</w:t>
       </w:r>
     </w:p>
     <w:p>
@@ -9912,7 +10166,21 @@
         <w:rPr>
           <w:rFonts w:eastAsia="Trebuchet MS"/>
         </w:rPr>
-        <w:t>For the reporting layer, this specifically includes combinations of dimension attributes used across visuals (for example product category, store/channel, payment type, and time period) together with each KPI, to confirm that filtering and cross-filtering behave correctly in every combination exercised.</w:t>
+        <w:t xml:space="preserve">For the reporting layer, this specifically includes combinations of dimension attributes used across visuals (for example product category, store/channel, payment type, and </w:t>
+      </w:r>
+      <w:proofErr w:type="gramStart"/>
+      <w:r>
+        <w:rPr>
+          <w:rFonts w:eastAsia="Trebuchet MS"/>
+        </w:rPr>
+        <w:t>time period</w:t>
+      </w:r>
+      <w:proofErr w:type="gramEnd"/>
+      <w:r>
+        <w:rPr>
+          <w:rFonts w:eastAsia="Trebuchet MS"/>
+        </w:rPr>
+        <w:t>) together with each KPI, to confirm that filtering and cross-filtering behave correctly in every combination exercised.</w:t>
       </w:r>
     </w:p>
     <w:p>
@@ -9975,6 +10243,7 @@
         <w:rPr>
           <w:rFonts w:eastAsia="Trebuchet MS"/>
         </w:rPr>
+        <w:lastRenderedPageBreak/>
         <w:t>Regression Testing Strategy</w:t>
       </w:r>
       <w:bookmarkEnd w:id="22"/>
@@ -10044,7 +10313,6 @@
               <w:rPr>
                 <w:rFonts w:eastAsia="Trebuchet MS"/>
               </w:rPr>
-              <w:lastRenderedPageBreak/>
               <w:t>Allocation</w:t>
             </w:r>
           </w:p>
@@ -10147,7 +10415,21 @@
               <w:rPr>
                 <w:rFonts w:eastAsia="Trebuchet MS"/>
               </w:rPr>
-              <w:t>Risk-based retesting of the areas most likely to be affected by the specific change made (for example, if a dimension load procedure changes, prioritize the corresponding dimension and every fact table column that depends on it)</w:t>
+              <w:t xml:space="preserve">Risk-based retesting of the </w:t>
+            </w:r>
+            <w:proofErr w:type="spellStart"/>
+            <w:r>
+              <w:rPr>
+                <w:rFonts w:eastAsia="Trebuchet MS"/>
+              </w:rPr>
+              <w:t>areas</w:t>
+            </w:r>
+            <w:proofErr w:type="spellEnd"/>
+            <w:r>
+              <w:rPr>
+                <w:rFonts w:eastAsia="Trebuchet MS"/>
+              </w:rPr>
+              <w:t xml:space="preserve"> most likely to be affected by the specific change made (for example, if a dimension load procedure changes, prioritize the corresponding dimension and every fact table column that depends on it)</w:t>
             </w:r>
           </w:p>
         </w:tc>
@@ -10334,7 +10616,21 @@
         <w:rPr>
           <w:rFonts w:eastAsia="Trebuchet MS"/>
         </w:rPr>
-        <w:t>Test cases covering any table or visual directly dependent on the changed component (for example a dimension change affects every fact table row referencing it).</w:t>
+        <w:t xml:space="preserve">Test cases covering any table or visual directly dependent on the changed component (for example a dimension change affects </w:t>
+      </w:r>
+      <w:proofErr w:type="gramStart"/>
+      <w:r>
+        <w:rPr>
+          <w:rFonts w:eastAsia="Trebuchet MS"/>
+        </w:rPr>
+        <w:t>every fact</w:t>
+      </w:r>
+      <w:proofErr w:type="gramEnd"/>
+      <w:r>
+        <w:rPr>
+          <w:rFonts w:eastAsia="Trebuchet MS"/>
+        </w:rPr>
+        <w:t xml:space="preserve"> table row referencing it).</w:t>
       </w:r>
     </w:p>
     <w:p>
@@ -10625,7 +10921,35 @@
               <w:rPr>
                 <w:rFonts w:eastAsia="Trebuchet MS"/>
               </w:rPr>
-              <w:t>Excel, Python (optionally pytest with SQLAlchemy)</w:t>
+              <w:t xml:space="preserve">Excel, Python (optionally </w:t>
+            </w:r>
+            <w:proofErr w:type="spellStart"/>
+            <w:r>
+              <w:rPr>
+                <w:rFonts w:eastAsia="Trebuchet MS"/>
+              </w:rPr>
+              <w:t>pytest</w:t>
+            </w:r>
+            <w:proofErr w:type="spellEnd"/>
+            <w:r>
+              <w:rPr>
+                <w:rFonts w:eastAsia="Trebuchet MS"/>
+              </w:rPr>
+              <w:t xml:space="preserve"> with </w:t>
+            </w:r>
+            <w:proofErr w:type="spellStart"/>
+            <w:r>
+              <w:rPr>
+                <w:rFonts w:eastAsia="Trebuchet MS"/>
+              </w:rPr>
+              <w:t>SQLAlchemy</w:t>
+            </w:r>
+            <w:proofErr w:type="spellEnd"/>
+            <w:r>
+              <w:rPr>
+                <w:rFonts w:eastAsia="Trebuchet MS"/>
+              </w:rPr>
+              <w:t>)</w:t>
             </w:r>
           </w:p>
         </w:tc>
@@ -10723,11 +11047,19 @@
                 <w:rFonts w:eastAsia="Trebuchet MS"/>
               </w:rPr>
             </w:pPr>
-            <w:r>
-              <w:rPr>
-                <w:rFonts w:eastAsia="Trebuchet MS"/>
-              </w:rPr>
-              <w:t>Report performance analysis</w:t>
+            <w:proofErr w:type="gramStart"/>
+            <w:r>
+              <w:rPr>
+                <w:rFonts w:eastAsia="Trebuchet MS"/>
+              </w:rPr>
+              <w:t>Report</w:t>
+            </w:r>
+            <w:proofErr w:type="gramEnd"/>
+            <w:r>
+              <w:rPr>
+                <w:rFonts w:eastAsia="Trebuchet MS"/>
+              </w:rPr>
+              <w:t xml:space="preserve"> performance analysis</w:t>
             </w:r>
           </w:p>
         </w:tc>
@@ -10793,6 +11125,7 @@
         <w:rPr>
           <w:rFonts w:eastAsia="Trebuchet MS"/>
         </w:rPr>
+        <w:lastRenderedPageBreak/>
         <w:t>Test Data Strategy</w:t>
       </w:r>
       <w:bookmarkEnd w:id="24"/>
@@ -10950,7 +11283,21 @@
               <w:rPr>
                 <w:rFonts w:eastAsia="Trebuchet MS"/>
               </w:rPr>
-              <w:t>The provided sample CSV files (retail-sample.csv, ecom-sample.csv) are used as the primary test data set for functional and data quality testing</w:t>
+              <w:t xml:space="preserve">The </w:t>
+            </w:r>
+            <w:proofErr w:type="gramStart"/>
+            <w:r>
+              <w:rPr>
+                <w:rFonts w:eastAsia="Trebuchet MS"/>
+              </w:rPr>
+              <w:t>provided sample CSV files</w:t>
+            </w:r>
+            <w:proofErr w:type="gramEnd"/>
+            <w:r>
+              <w:rPr>
+                <w:rFonts w:eastAsia="Trebuchet MS"/>
+              </w:rPr>
+              <w:t xml:space="preserve"> (retail-sample.csv, ecom-sample.csv) are used as the primary test data set for functional and data quality testing</w:t>
             </w:r>
           </w:p>
         </w:tc>
@@ -10985,7 +11332,6 @@
               <w:rPr>
                 <w:rFonts w:eastAsia="Trebuchet MS"/>
               </w:rPr>
-              <w:lastRenderedPageBreak/>
               <w:t>Sensitive data handling</w:t>
             </w:r>
           </w:p>
@@ -11371,7 +11717,14 @@
               <w:rPr>
                 <w:rFonts w:eastAsia="Trebuchet MS"/>
               </w:rPr>
-              <w:t>PostgreSQL instance hosting sa</w:t>
+              <w:t xml:space="preserve">PostgreSQL instance hosting </w:t>
+            </w:r>
+            <w:proofErr w:type="spellStart"/>
+            <w:r>
+              <w:rPr>
+                <w:rFonts w:eastAsia="Trebuchet MS"/>
+              </w:rPr>
+              <w:t>sa</w:t>
             </w:r>
             <w:r>
               <w:rPr>
@@ -11379,27 +11732,82 @@
                 <w:i/>
                 <w:iCs/>
               </w:rPr>
-              <w:t>retail, sa</w:t>
-            </w:r>
-            <w:r>
-              <w:rPr>
-                <w:rFonts w:eastAsia="Trebuchet MS"/>
-              </w:rPr>
-              <w:t>ecom, bl</w:t>
-            </w:r>
+              <w:t>retail</w:t>
+            </w:r>
+            <w:proofErr w:type="spellEnd"/>
             <w:r>
               <w:rPr>
                 <w:rFonts w:eastAsia="Trebuchet MS"/>
                 <w:i/>
                 <w:iCs/>
               </w:rPr>
-              <w:t>3nf, bl</w:t>
-            </w:r>
-            <w:r>
-              <w:rPr>
-                <w:rFonts w:eastAsia="Trebuchet MS"/>
-              </w:rPr>
-              <w:t>dm, and bl_cl schemas</w:t>
+              <w:t xml:space="preserve">, </w:t>
+            </w:r>
+            <w:proofErr w:type="spellStart"/>
+            <w:r>
+              <w:rPr>
+                <w:rFonts w:eastAsia="Trebuchet MS"/>
+                <w:i/>
+                <w:iCs/>
+              </w:rPr>
+              <w:t>sa</w:t>
+            </w:r>
+            <w:r>
+              <w:rPr>
+                <w:rFonts w:eastAsia="Trebuchet MS"/>
+              </w:rPr>
+              <w:t>ecom</w:t>
+            </w:r>
+            <w:proofErr w:type="spellEnd"/>
+            <w:r>
+              <w:rPr>
+                <w:rFonts w:eastAsia="Trebuchet MS"/>
+              </w:rPr>
+              <w:t>, bl</w:t>
+            </w:r>
+            <w:r>
+              <w:rPr>
+                <w:rFonts w:eastAsia="Trebuchet MS"/>
+                <w:i/>
+                <w:iCs/>
+              </w:rPr>
+              <w:t xml:space="preserve">3nf, </w:t>
+            </w:r>
+            <w:proofErr w:type="spellStart"/>
+            <w:r>
+              <w:rPr>
+                <w:rFonts w:eastAsia="Trebuchet MS"/>
+                <w:i/>
+                <w:iCs/>
+              </w:rPr>
+              <w:t>bl</w:t>
+            </w:r>
+            <w:r>
+              <w:rPr>
+                <w:rFonts w:eastAsia="Trebuchet MS"/>
+              </w:rPr>
+              <w:t>dm</w:t>
+            </w:r>
+            <w:proofErr w:type="spellEnd"/>
+            <w:r>
+              <w:rPr>
+                <w:rFonts w:eastAsia="Trebuchet MS"/>
+              </w:rPr>
+              <w:t xml:space="preserve">, and </w:t>
+            </w:r>
+            <w:proofErr w:type="spellStart"/>
+            <w:r>
+              <w:rPr>
+                <w:rFonts w:eastAsia="Trebuchet MS"/>
+              </w:rPr>
+              <w:t>bl_cl</w:t>
+            </w:r>
+            <w:proofErr w:type="spellEnd"/>
+            <w:r>
+              <w:rPr>
+                <w:rFonts w:eastAsia="Trebuchet MS"/>
+              </w:rPr>
+              <w:t xml:space="preserve"> schemas</w:t>
             </w:r>
           </w:p>
         </w:tc>
@@ -11462,11 +11870,19 @@
                 <w:rFonts w:eastAsia="Trebuchet MS"/>
               </w:rPr>
             </w:pPr>
-            <w:r>
-              <w:rPr>
-                <w:rFonts w:eastAsia="Trebuchet MS"/>
-              </w:rPr>
-              <w:t>file_fdw foreign data wrapper pointing to the local CSV file location</w:t>
+            <w:proofErr w:type="spellStart"/>
+            <w:r>
+              <w:rPr>
+                <w:rFonts w:eastAsia="Trebuchet MS"/>
+              </w:rPr>
+              <w:t>file_fdw</w:t>
+            </w:r>
+            <w:proofErr w:type="spellEnd"/>
+            <w:r>
+              <w:rPr>
+                <w:rFonts w:eastAsia="Trebuchet MS"/>
+              </w:rPr>
+              <w:t xml:space="preserve"> foreign data wrapper pointing to the local CSV file location</w:t>
             </w:r>
           </w:p>
         </w:tc>
@@ -11533,7 +11949,21 @@
               <w:rPr>
                 <w:rFonts w:eastAsia="Trebuchet MS"/>
               </w:rPr>
-              <w:t>Power BI Desktop connected to the bl_dm schema</w:t>
+              <w:t xml:space="preserve">Power BI Desktop connected to the </w:t>
+            </w:r>
+            <w:proofErr w:type="spellStart"/>
+            <w:r>
+              <w:rPr>
+                <w:rFonts w:eastAsia="Trebuchet MS"/>
+              </w:rPr>
+              <w:t>bl_dm</w:t>
+            </w:r>
+            <w:proofErr w:type="spellEnd"/>
+            <w:r>
+              <w:rPr>
+                <w:rFonts w:eastAsia="Trebuchet MS"/>
+              </w:rPr>
+              <w:t xml:space="preserve"> schema</w:t>
             </w:r>
           </w:p>
         </w:tc>
@@ -11705,6 +12135,7 @@
         <w:rPr>
           <w:rFonts w:eastAsia="Trebuchet MS"/>
         </w:rPr>
+        <w:lastRenderedPageBreak/>
         <w:t>Test cases and checklist items for the layer under test have been prepared.</w:t>
       </w:r>
     </w:p>
@@ -11757,7 +12188,6 @@
         <w:rPr>
           <w:rFonts w:eastAsia="Trebuchet MS"/>
         </w:rPr>
-        <w:lastRenderedPageBreak/>
         <w:t>All Smoke and Critical Path test cases have been executed.</w:t>
       </w:r>
     </w:p>
@@ -11827,7 +12257,7 @@
           <w:rFonts w:eastAsia="Trebuchet MS"/>
         </w:rPr>
         <w:pict w14:anchorId="39A7C115">
-          <v:rect id="_x0000_i1040" style="width:0;height:1.5pt" o:hrstd="t" o:hr="t" fillcolor="#a0a0a0" stroked="f"/>
+          <v:rect id="_x0000_i1039" style="width:0;height:1.5pt" o:hrstd="t" o:hr="t" fillcolor="#a0a0a0" stroked="f"/>
         </w:pict>
       </w:r>
     </w:p>
@@ -12874,7 +13304,7 @@
           <w:rFonts w:eastAsia="Trebuchet MS"/>
         </w:rPr>
         <w:pict w14:anchorId="73A71100">
-          <v:rect id="_x0000_i1041" style="width:0;height:1.5pt" o:hrstd="t" o:hr="t" fillcolor="#a0a0a0" stroked="f"/>
+          <v:rect id="_x0000_i1040" style="width:0;height:1.5pt" o:hrstd="t" o:hr="t" fillcolor="#a0a0a0" stroked="f"/>
         </w:pict>
       </w:r>
     </w:p>
@@ -12890,6 +13320,7 @@
         <w:rPr>
           <w:rFonts w:eastAsia="Trebuchet MS"/>
         </w:rPr>
+        <w:lastRenderedPageBreak/>
         <w:t>Defect Tracking</w:t>
       </w:r>
       <w:bookmarkEnd w:id="30"/>
@@ -12961,7 +13392,6 @@
               <w:rPr>
                 <w:rFonts w:eastAsia="Trebuchet MS"/>
               </w:rPr>
-              <w:lastRenderedPageBreak/>
               <w:t>Type</w:t>
             </w:r>
           </w:p>
@@ -13985,6 +14415,7 @@
               <w:rPr>
                 <w:rFonts w:eastAsia="Trebuchet MS"/>
               </w:rPr>
+              <w:lastRenderedPageBreak/>
               <w:t>Medium</w:t>
             </w:r>
           </w:p>
@@ -14102,7 +14533,6 @@
         <w:rPr>
           <w:rFonts w:eastAsia="Trebuchet MS"/>
         </w:rPr>
-        <w:lastRenderedPageBreak/>
         <w:t>Issue Naming Convention</w:t>
       </w:r>
       <w:bookmarkEnd w:id="34"/>
@@ -14198,7 +14628,35 @@
         <w:rPr>
           <w:rFonts w:eastAsia="Trebuchet MS"/>
         </w:rPr>
-        <w:t>In Progress - developer investigates and works on a fix.</w:t>
+        <w:t xml:space="preserve">In Progress - </w:t>
+      </w:r>
+      <w:proofErr w:type="gramStart"/>
+      <w:r>
+        <w:rPr>
+          <w:rFonts w:eastAsia="Trebuchet MS"/>
+        </w:rPr>
+        <w:t>developer investigates</w:t>
+      </w:r>
+      <w:proofErr w:type="gramEnd"/>
+      <w:r>
+        <w:rPr>
+          <w:rFonts w:eastAsia="Trebuchet MS"/>
+        </w:rPr>
+        <w:t xml:space="preserve"> and </w:t>
+      </w:r>
+      <w:proofErr w:type="gramStart"/>
+      <w:r>
+        <w:rPr>
+          <w:rFonts w:eastAsia="Trebuchet MS"/>
+        </w:rPr>
+        <w:t>works</w:t>
+      </w:r>
+      <w:proofErr w:type="gramEnd"/>
+      <w:r>
+        <w:rPr>
+          <w:rFonts w:eastAsia="Trebuchet MS"/>
+        </w:rPr>
+        <w:t xml:space="preserve"> on a fix.</w:t>
       </w:r>
     </w:p>
     <w:p>
@@ -14281,195 +14739,209 @@
           <w:rFonts w:eastAsia="Trebuchet MS"/>
         </w:rPr>
         <w:pict w14:anchorId="6B442D0D">
+          <v:rect id="_x0000_i1041" style="width:0;height:1.5pt" o:hrstd="t" o:hr="t" fillcolor="#a0a0a0" stroked="f"/>
+        </w:pict>
+      </w:r>
+    </w:p>
+    <w:p>
+      <w:pPr>
+        <w:pStyle w:val="Heading1"/>
+        <w:rPr>
+          <w:rFonts w:eastAsia="Trebuchet MS"/>
+        </w:rPr>
+      </w:pPr>
+      <w:bookmarkStart w:id="36" w:name="_Toc238724844"/>
+      <w:r>
+        <w:rPr>
+          <w:rFonts w:eastAsia="Trebuchet MS"/>
+        </w:rPr>
+        <w:t>Quality and Acceptance Criteria</w:t>
+      </w:r>
+      <w:bookmarkEnd w:id="36"/>
+    </w:p>
+    <w:p>
+      <w:pPr>
+        <w:pStyle w:val="BodyText"/>
+        <w:rPr>
+          <w:rFonts w:eastAsia="Trebuchet MS"/>
+        </w:rPr>
+      </w:pPr>
+      <w:r>
+        <w:rPr>
+          <w:rFonts w:eastAsia="Trebuchet MS"/>
+        </w:rPr>
+        <w:t xml:space="preserve">The solution is considered ready for delivery when </w:t>
+      </w:r>
+      <w:proofErr w:type="gramStart"/>
+      <w:r>
+        <w:rPr>
+          <w:rFonts w:eastAsia="Trebuchet MS"/>
+        </w:rPr>
+        <w:t>all of</w:t>
+      </w:r>
+      <w:proofErr w:type="gramEnd"/>
+      <w:r>
+        <w:rPr>
+          <w:rFonts w:eastAsia="Trebuchet MS"/>
+        </w:rPr>
+        <w:t xml:space="preserve"> the following are true:</w:t>
+      </w:r>
+    </w:p>
+    <w:p>
+      <w:pPr>
+        <w:pStyle w:val="BodyText"/>
+        <w:numPr>
+          <w:ilvl w:val="0"/>
+          <w:numId w:val="40"/>
+        </w:numPr>
+        <w:rPr>
+          <w:rFonts w:eastAsia="Trebuchet MS"/>
+        </w:rPr>
+      </w:pPr>
+      <w:r>
+        <w:rPr>
+          <w:rFonts w:eastAsia="Trebuchet MS"/>
+        </w:rPr>
+        <w:t>No Critical or Blocker defect remains open.</w:t>
+      </w:r>
+    </w:p>
+    <w:p>
+      <w:pPr>
+        <w:pStyle w:val="BodyText"/>
+        <w:numPr>
+          <w:ilvl w:val="0"/>
+          <w:numId w:val="40"/>
+        </w:numPr>
+        <w:rPr>
+          <w:rFonts w:eastAsia="Trebuchet MS"/>
+        </w:rPr>
+      </w:pPr>
+      <w:r>
+        <w:rPr>
+          <w:rFonts w:eastAsia="Trebuchet MS"/>
+        </w:rPr>
+        <w:t>No more than a small, explicitly agreed number of Major defects remain open, each with a documented workaround accepted by the project stakeholder (for example: no more than 2 Major defects open at delivery).</w:t>
+      </w:r>
+    </w:p>
+    <w:p>
+      <w:pPr>
+        <w:pStyle w:val="BodyText"/>
+        <w:numPr>
+          <w:ilvl w:val="0"/>
+          <w:numId w:val="40"/>
+        </w:numPr>
+        <w:rPr>
+          <w:rFonts w:eastAsia="Trebuchet MS"/>
+        </w:rPr>
+      </w:pPr>
+      <w:r>
+        <w:rPr>
+          <w:rFonts w:eastAsia="Trebuchet MS"/>
+        </w:rPr>
+        <w:t>No more than 5 Minor defects remain open at delivery.</w:t>
+      </w:r>
+    </w:p>
+    <w:p>
+      <w:pPr>
+        <w:pStyle w:val="BodyText"/>
+        <w:numPr>
+          <w:ilvl w:val="0"/>
+          <w:numId w:val="40"/>
+        </w:numPr>
+        <w:rPr>
+          <w:rFonts w:eastAsia="Trebuchet MS"/>
+        </w:rPr>
+      </w:pPr>
+      <w:r>
+        <w:rPr>
+          <w:rFonts w:eastAsia="Trebuchet MS"/>
+        </w:rPr>
+        <w:t>100% of requirements captured in the Requirements Traceability Matrix have at least one associated, executed test case.</w:t>
+      </w:r>
+    </w:p>
+    <w:p>
+      <w:pPr>
+        <w:pStyle w:val="BodyText"/>
+        <w:numPr>
+          <w:ilvl w:val="0"/>
+          <w:numId w:val="40"/>
+        </w:numPr>
+        <w:rPr>
+          <w:rFonts w:eastAsia="Trebuchet MS"/>
+        </w:rPr>
+      </w:pPr>
+      <w:r>
+        <w:rPr>
+          <w:rFonts w:eastAsia="Trebuchet MS"/>
+        </w:rPr>
+        <w:t>All Smoke and Critical Path test cases have a Pass status.</w:t>
+      </w:r>
+    </w:p>
+    <w:p>
+      <w:pPr>
+        <w:pStyle w:val="BodyText"/>
+        <w:numPr>
+          <w:ilvl w:val="0"/>
+          <w:numId w:val="40"/>
+        </w:numPr>
+        <w:rPr>
+          <w:rFonts w:eastAsia="Trebuchet MS"/>
+        </w:rPr>
+      </w:pPr>
+      <w:r>
+        <w:rPr>
+          <w:rFonts w:eastAsia="Trebuchet MS"/>
+        </w:rPr>
+        <w:t>Row count and referential integrity reconciliation across Source, SA, BL_3NF, and BL_DM shows no unexplained discrepancy.</w:t>
+      </w:r>
+    </w:p>
+    <w:p>
+      <w:pPr>
+        <w:pStyle w:val="BodyText"/>
+        <w:numPr>
+          <w:ilvl w:val="0"/>
+          <w:numId w:val="40"/>
+        </w:numPr>
+        <w:rPr>
+          <w:rFonts w:eastAsia="Trebuchet MS"/>
+        </w:rPr>
+      </w:pPr>
+      <w:r>
+        <w:rPr>
+          <w:rFonts w:eastAsia="Trebuchet MS"/>
+        </w:rPr>
+        <w:t>Sensitive source columns are confirmed absent from BL_3NF, BL_DM, and the report in every test cycle.</w:t>
+      </w:r>
+    </w:p>
+    <w:p>
+      <w:pPr>
+        <w:pStyle w:val="BodyText"/>
+        <w:rPr>
+          <w:rFonts w:eastAsia="Trebuchet MS"/>
+        </w:rPr>
+      </w:pPr>
+      <w:r>
+        <w:rPr>
+          <w:rFonts w:eastAsia="Trebuchet MS"/>
+        </w:rPr>
+        <w:pict w14:anchorId="318135E6">
           <v:rect id="_x0000_i1042" style="width:0;height:1.5pt" o:hrstd="t" o:hr="t" fillcolor="#a0a0a0" stroked="f"/>
         </w:pict>
       </w:r>
     </w:p>
     <w:p>
       <w:pPr>
-        <w:pStyle w:val="Heading1"/>
-        <w:rPr>
-          <w:rFonts w:eastAsia="Trebuchet MS"/>
-        </w:rPr>
-      </w:pPr>
-      <w:bookmarkStart w:id="36" w:name="_Toc238724844"/>
+        <w:pStyle w:val="BodyText"/>
+        <w:rPr>
+          <w:rFonts w:eastAsia="Trebuchet MS"/>
+        </w:rPr>
+      </w:pPr>
       <w:r>
         <w:rPr>
           <w:rFonts w:eastAsia="Trebuchet MS"/>
         </w:rPr>
-        <w:t>Quality and Acceptance Criteria</w:t>
-      </w:r>
-      <w:bookmarkEnd w:id="36"/>
-    </w:p>
-    <w:p>
-      <w:pPr>
-        <w:pStyle w:val="BodyText"/>
-        <w:rPr>
-          <w:rFonts w:eastAsia="Trebuchet MS"/>
-        </w:rPr>
-      </w:pPr>
-      <w:r>
-        <w:rPr>
-          <w:rFonts w:eastAsia="Trebuchet MS"/>
-        </w:rPr>
-        <w:t>The solution is considered ready for delivery when all of the following are true:</w:t>
-      </w:r>
-    </w:p>
-    <w:p>
-      <w:pPr>
-        <w:pStyle w:val="BodyText"/>
-        <w:numPr>
-          <w:ilvl w:val="0"/>
-          <w:numId w:val="40"/>
-        </w:numPr>
-        <w:rPr>
-          <w:rFonts w:eastAsia="Trebuchet MS"/>
-        </w:rPr>
-      </w:pPr>
-      <w:r>
-        <w:rPr>
-          <w:rFonts w:eastAsia="Trebuchet MS"/>
-        </w:rPr>
-        <w:t>No Critical or Blocker defect remains open.</w:t>
-      </w:r>
-    </w:p>
-    <w:p>
-      <w:pPr>
-        <w:pStyle w:val="BodyText"/>
-        <w:numPr>
-          <w:ilvl w:val="0"/>
-          <w:numId w:val="40"/>
-        </w:numPr>
-        <w:rPr>
-          <w:rFonts w:eastAsia="Trebuchet MS"/>
-        </w:rPr>
-      </w:pPr>
-      <w:r>
-        <w:rPr>
-          <w:rFonts w:eastAsia="Trebuchet MS"/>
-        </w:rPr>
-        <w:t>No more than a small, explicitly agreed number of Major defects remain open, each with a documented workaround accepted by the project stakeholder (for example: no more than 2 Major defects open at delivery).</w:t>
-      </w:r>
-    </w:p>
-    <w:p>
-      <w:pPr>
-        <w:pStyle w:val="BodyText"/>
-        <w:numPr>
-          <w:ilvl w:val="0"/>
-          <w:numId w:val="40"/>
-        </w:numPr>
-        <w:rPr>
-          <w:rFonts w:eastAsia="Trebuchet MS"/>
-        </w:rPr>
-      </w:pPr>
-      <w:r>
-        <w:rPr>
-          <w:rFonts w:eastAsia="Trebuchet MS"/>
-        </w:rPr>
-        <w:t>No more than 5 Minor defects remain open at delivery.</w:t>
-      </w:r>
-    </w:p>
-    <w:p>
-      <w:pPr>
-        <w:pStyle w:val="BodyText"/>
-        <w:numPr>
-          <w:ilvl w:val="0"/>
-          <w:numId w:val="40"/>
-        </w:numPr>
-        <w:rPr>
-          <w:rFonts w:eastAsia="Trebuchet MS"/>
-        </w:rPr>
-      </w:pPr>
-      <w:r>
-        <w:rPr>
-          <w:rFonts w:eastAsia="Trebuchet MS"/>
-        </w:rPr>
-        <w:t>100% of requirements captured in the Requirements Traceability Matrix have at least one associated, executed test case.</w:t>
-      </w:r>
-    </w:p>
-    <w:p>
-      <w:pPr>
-        <w:pStyle w:val="BodyText"/>
-        <w:numPr>
-          <w:ilvl w:val="0"/>
-          <w:numId w:val="40"/>
-        </w:numPr>
-        <w:rPr>
-          <w:rFonts w:eastAsia="Trebuchet MS"/>
-        </w:rPr>
-      </w:pPr>
-      <w:r>
-        <w:rPr>
-          <w:rFonts w:eastAsia="Trebuchet MS"/>
-        </w:rPr>
-        <w:t>All Smoke and Critical Path test cases have a Pass status.</w:t>
-      </w:r>
-    </w:p>
-    <w:p>
-      <w:pPr>
-        <w:pStyle w:val="BodyText"/>
-        <w:numPr>
-          <w:ilvl w:val="0"/>
-          <w:numId w:val="40"/>
-        </w:numPr>
-        <w:rPr>
-          <w:rFonts w:eastAsia="Trebuchet MS"/>
-        </w:rPr>
-      </w:pPr>
-      <w:r>
-        <w:rPr>
-          <w:rFonts w:eastAsia="Trebuchet MS"/>
-        </w:rPr>
-        <w:t>Row count and referential integrity reconciliation across Source, SA, BL_3NF, and BL_DM shows no unexplained discrepancy.</w:t>
-      </w:r>
-    </w:p>
-    <w:p>
-      <w:pPr>
-        <w:pStyle w:val="BodyText"/>
-        <w:numPr>
-          <w:ilvl w:val="0"/>
-          <w:numId w:val="40"/>
-        </w:numPr>
-        <w:rPr>
-          <w:rFonts w:eastAsia="Trebuchet MS"/>
-        </w:rPr>
-      </w:pPr>
-      <w:r>
-        <w:rPr>
-          <w:rFonts w:eastAsia="Trebuchet MS"/>
-        </w:rPr>
-        <w:t>Sensitive source columns are confirmed absent from BL_3NF, BL_DM, and the report in every test cycle.</w:t>
-      </w:r>
-    </w:p>
-    <w:p>
-      <w:pPr>
-        <w:pStyle w:val="BodyText"/>
-        <w:rPr>
-          <w:rFonts w:eastAsia="Trebuchet MS"/>
-        </w:rPr>
-      </w:pPr>
-      <w:r>
-        <w:rPr>
-          <w:rFonts w:eastAsia="Trebuchet MS"/>
-        </w:rPr>
-        <w:pict w14:anchorId="318135E6">
+        <w:pict w14:anchorId="44FD7ADE">
           <v:rect id="_x0000_i1043" style="width:0;height:1.5pt" o:hrstd="t" o:hr="t" fillcolor="#a0a0a0" stroked="f"/>
-        </w:pict>
-      </w:r>
-    </w:p>
-    <w:p>
-      <w:pPr>
-        <w:pStyle w:val="BodyText"/>
-        <w:rPr>
-          <w:rFonts w:eastAsia="Trebuchet MS"/>
-        </w:rPr>
-      </w:pPr>
-      <w:r>
-        <w:rPr>
-          <w:rFonts w:eastAsia="Trebuchet MS"/>
-        </w:rPr>
-        <w:pict w14:anchorId="44FD7ADE">
-          <v:rect id="_x0000_i1044" style="width:0;height:1.5pt" o:hrstd="t" o:hr="t" fillcolor="#a0a0a0" stroked="f"/>
         </w:pict>
       </w:r>
     </w:p>
@@ -15204,7 +15676,7 @@
             </wp:anchor>
           </w:drawing>
         </mc:Choice>
-        <mc:Fallback xmlns:a="http://schemas.openxmlformats.org/drawingml/2006/main" xmlns:pic="http://schemas.openxmlformats.org/drawingml/2006/picture" xmlns:a14="http://schemas.microsoft.com/office/drawing/2010/main">
+        <mc:Fallback xmlns:a14="http://schemas.microsoft.com/office/drawing/2010/main" xmlns:pic="http://schemas.openxmlformats.org/drawingml/2006/picture" xmlns:a="http://schemas.openxmlformats.org/drawingml/2006/main">
           <w:pict w14:anchorId="70B2AECB">
             <v:line id="Straight Connector 4" style="position:absolute;z-index:251659776;visibility:visible;mso-wrap-style:square;mso-width-percent:0;mso-wrap-distance-left:9pt;mso-wrap-distance-top:0;mso-wrap-distance-right:9pt;mso-wrap-distance-bottom:0;mso-position-horizontal:absolute;mso-position-horizontal-relative:text;mso-position-vertical:absolute;mso-position-vertical-relative:text;mso-width-percent:0;mso-width-relative:margin" o:spid="_x0000_s1026" strokecolor="#393737 [814]" strokeweight="2pt" from="-.65pt,1.25pt" to="467.35pt,1.25pt" w14:anchorId="7A1F2F3F" o:gfxdata="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">
               <v:stroke joinstyle="miter"/>
@@ -20830,6 +21302,7 @@
   <w:style w:type="character" w:default="1" w:styleId="DefaultParagraphFont">
     <w:name w:val="Default Paragraph Font"/>
     <w:uiPriority w:val="1"/>
+    <w:semiHidden/>
     <w:unhideWhenUsed/>
   </w:style>
   <w:style w:type="table" w:default="1" w:styleId="TableNormal">
@@ -22260,6 +22733,10 @@
 </file>
 
 <file path=customXml/item1.xml><?xml version="1.0" encoding="utf-8"?>
+<b:Sources xmlns:b="http://schemas.openxmlformats.org/officeDocument/2006/bibliography" xmlns="http://schemas.openxmlformats.org/officeDocument/2006/bibliography" SelectedStyle="\APASixthEditionOfficeOnline.xsl" StyleName="APA" Version="6"/>
+</file>
+
+<file path=customXml/item2.xml><?xml version="1.0" encoding="utf-8"?>
 <p:properties xmlns:p="http://schemas.microsoft.com/office/2006/metadata/properties" xmlns:xsi="http://www.w3.org/2001/XMLSchema-instance" xmlns:pc="http://schemas.microsoft.com/office/infopath/2007/PartnerControls">
   <documentManagement>
     <TaxCatchAll xmlns="55af1afe-24e9-4d9e-8b54-53f2032f41af" xsi:nil="true"/>
@@ -22270,11 +22747,16 @@
 </p:properties>
 </file>
 
-<file path=customXml/item2.xml><?xml version="1.0" encoding="utf-8"?>
-<b:Sources xmlns:b="http://schemas.openxmlformats.org/officeDocument/2006/bibliography" xmlns="http://schemas.openxmlformats.org/officeDocument/2006/bibliography" SelectedStyle="\APASixthEditionOfficeOnline.xsl" StyleName="APA" Version="6"/>
+<file path=customXml/item3.xml><?xml version="1.0" encoding="utf-8"?>
+<?mso-contentType ?>
+<FormTemplates xmlns="http://schemas.microsoft.com/sharepoint/v3/contenttype/forms">
+  <Display>DocumentLibraryForm</Display>
+  <Edit>DocumentLibraryForm</Edit>
+  <New>DocumentLibraryForm</New>
+</FormTemplates>
 </file>
 
-<file path=customXml/item3.xml><?xml version="1.0" encoding="utf-8"?>
+<file path=customXml/item4.xml><?xml version="1.0" encoding="utf-8"?>
 <ct:contentTypeSchema xmlns:ct="http://schemas.microsoft.com/office/2006/metadata/contentType" xmlns:ma="http://schemas.microsoft.com/office/2006/metadata/properties/metaAttributes" ct:_="" ma:_="" ma:contentTypeName="Document" ma:contentTypeID="0x0101002F54897E54BA54408664CA011F7489F6" ma:contentTypeVersion="17" ma:contentTypeDescription="Create a new document." ma:contentTypeScope="" ma:versionID="36c8e91a9c218b609a25d14f455d7423">
   <xsd:schema xmlns:xsd="http://www.w3.org/2001/XMLSchema" xmlns:xs="http://www.w3.org/2001/XMLSchema" xmlns:p="http://schemas.microsoft.com/office/2006/metadata/properties" xmlns:ns2="59158387-0b2d-4d97-a983-e5561f7f08d0" xmlns:ns3="55af1afe-24e9-4d9e-8b54-53f2032f41af" targetNamespace="http://schemas.microsoft.com/office/2006/metadata/properties" ma:root="true" ma:fieldsID="fd796370758a6950f549c672f58b0ecc" ns2:_="" ns3:_="">
     <xsd:import namespace="59158387-0b2d-4d97-a983-e5561f7f08d0"/>
@@ -22523,16 +23005,15 @@
 </ct:contentTypeSchema>
 </file>
 
-<file path=customXml/item4.xml><?xml version="1.0" encoding="utf-8"?>
-<?mso-contentType ?>
-<FormTemplates xmlns="http://schemas.microsoft.com/sharepoint/v3/contenttype/forms">
-  <Display>DocumentLibraryForm</Display>
-  <Edit>DocumentLibraryForm</Edit>
-  <New>DocumentLibraryForm</New>
-</FormTemplates>
+<file path=customXml/itemProps1.xml><?xml version="1.0" encoding="utf-8"?>
+<ds:datastoreItem xmlns:ds="http://schemas.openxmlformats.org/officeDocument/2006/customXml" ds:itemID="{B177E03F-EDB8-41F1-8E7A-FAC23B29580C}">
+  <ds:schemaRefs>
+    <ds:schemaRef ds:uri="http://schemas.openxmlformats.org/officeDocument/2006/bibliography"/>
+  </ds:schemaRefs>
+</ds:datastoreItem>
 </file>
 
-<file path=customXml/itemProps1.xml><?xml version="1.0" encoding="utf-8"?>
+<file path=customXml/itemProps2.xml><?xml version="1.0" encoding="utf-8"?>
 <ds:datastoreItem xmlns:ds="http://schemas.openxmlformats.org/officeDocument/2006/customXml" ds:itemID="{D91F561C-F884-4001-B1A2-C196647BA78D}">
   <ds:schemaRefs>
     <ds:schemaRef ds:uri="http://schemas.microsoft.com/office/2006/metadata/properties"/>
@@ -22543,15 +23024,15 @@
 </ds:datastoreItem>
 </file>
 
-<file path=customXml/itemProps2.xml><?xml version="1.0" encoding="utf-8"?>
-<ds:datastoreItem xmlns:ds="http://schemas.openxmlformats.org/officeDocument/2006/customXml" ds:itemID="{B177E03F-EDB8-41F1-8E7A-FAC23B29580C}">
+<file path=customXml/itemProps3.xml><?xml version="1.0" encoding="utf-8"?>
+<ds:datastoreItem xmlns:ds="http://schemas.openxmlformats.org/officeDocument/2006/customXml" ds:itemID="{49D3E13A-69F5-4E5D-9A2E-D99F93E0E7A9}">
   <ds:schemaRefs>
-    <ds:schemaRef ds:uri="http://schemas.openxmlformats.org/officeDocument/2006/bibliography"/>
+    <ds:schemaRef ds:uri="http://schemas.microsoft.com/sharepoint/v3/contenttype/forms"/>
   </ds:schemaRefs>
 </ds:datastoreItem>
 </file>
 
-<file path=customXml/itemProps3.xml><?xml version="1.0" encoding="utf-8"?>
+<file path=customXml/itemProps4.xml><?xml version="1.0" encoding="utf-8"?>
 <ds:datastoreItem xmlns:ds="http://schemas.openxmlformats.org/officeDocument/2006/customXml" ds:itemID="{C7A43183-CC32-4D6F-A4D6-405D54EDCE17}">
   <ds:schemaRefs>
     <ds:schemaRef ds:uri="http://schemas.microsoft.com/office/2006/metadata/contentType"/>
@@ -22568,12 +23049,4 @@
     <ds:schemaRef ds:uri="http://schemas.microsoft.com/internal/obd"/>
   </ds:schemaRefs>
 </ds:datastoreItem>
-</file>
-
-<file path=customXml/itemProps4.xml><?xml version="1.0" encoding="utf-8"?>
-<ds:datastoreItem xmlns:ds="http://schemas.openxmlformats.org/officeDocument/2006/customXml" ds:itemID="{49D3E13A-69F5-4E5D-9A2E-D99F93E0E7A9}">
-  <ds:schemaRefs>
-    <ds:schemaRef ds:uri="http://schemas.microsoft.com/sharepoint/v3/contenttype/forms"/>
-  </ds:schemaRefs>
-</ds:datastoreItem>
 </file>
</xml_diff>